<commit_message>
Changed template to include 3 experiences and also changed thinking setting.
</commit_message>
<xml_diff>
--- a/Resources/Resume Template.docx
+++ b/Resources/Resume Template.docx
@@ -634,7 +634,6 @@
               <w:spacing w:after="0"/>
               <w:ind w:left="360" w:right="0"/>
               <w:rPr>
-                <w:rFonts w:cstheme="majorHAnsi"/>
                 <w:sz w:val="22"/>
                 <w:szCs w:val="22"/>
               </w:rPr>
@@ -662,6 +661,212 @@
                 <w:szCs w:val="22"/>
               </w:rPr>
               <w:t>3}</w:t>
+            </w:r>
+          </w:p>
+          <w:p>
+            <w:pPr>
+              <w:pStyle w:val="ResumeText"/>
+              <w:numPr>
+                <w:ilvl w:val="0"/>
+                <w:numId w:val="9"/>
+              </w:numPr>
+              <w:spacing w:after="0"/>
+              <w:ind w:left="360" w:right="0"/>
+              <w:rPr>
+                <w:sz w:val="22"/>
+                <w:szCs w:val="22"/>
+              </w:rPr>
+            </w:pPr>
+            <w:r>
+              <w:rPr>
+                <w:sz w:val="22"/>
+                <w:szCs w:val="22"/>
+              </w:rPr>
+              <w:t>{J2Details4}</w:t>
+            </w:r>
+          </w:p>
+          <w:p>
+            <w:pPr>
+              <w:pStyle w:val="ResumeText"/>
+              <w:spacing w:after="0"/>
+              <w:ind w:right="0"/>
+              <w:rPr>
+                <w:b/>
+                <w:bCs/>
+                <w:sz w:val="22"/>
+                <w:szCs w:val="22"/>
+              </w:rPr>
+            </w:pPr>
+            <w:r>
+              <w:rPr>
+                <w:b/>
+                <w:bCs/>
+                <w:sz w:val="22"/>
+                <w:szCs w:val="22"/>
+              </w:rPr>
+              <w:t>{Job</w:t>
+            </w:r>
+            <w:r>
+              <w:rPr>
+                <w:b/>
+                <w:bCs/>
+                <w:sz w:val="22"/>
+                <w:szCs w:val="22"/>
+              </w:rPr>
+              <w:t>3</w:t>
+            </w:r>
+            <w:r>
+              <w:rPr>
+                <w:b/>
+                <w:bCs/>
+                <w:sz w:val="22"/>
+                <w:szCs w:val="22"/>
+              </w:rPr>
+              <w:t>Title}</w:t>
+            </w:r>
+          </w:p>
+          <w:p>
+            <w:pPr>
+              <w:pStyle w:val="ResumeText"/>
+              <w:numPr>
+                <w:ilvl w:val="0"/>
+                <w:numId w:val="9"/>
+              </w:numPr>
+              <w:spacing w:after="0"/>
+              <w:ind w:left="360" w:right="0"/>
+              <w:rPr>
+                <w:rFonts w:cstheme="majorHAnsi"/>
+                <w:sz w:val="22"/>
+                <w:szCs w:val="22"/>
+              </w:rPr>
+            </w:pPr>
+            <w:r>
+              <w:rPr>
+                <w:rFonts w:cstheme="majorHAnsi"/>
+                <w:sz w:val="22"/>
+                <w:szCs w:val="22"/>
+              </w:rPr>
+              <w:t>{J</w:t>
+            </w:r>
+            <w:r>
+              <w:rPr>
+                <w:rFonts w:cstheme="majorHAnsi"/>
+                <w:sz w:val="22"/>
+                <w:szCs w:val="22"/>
+              </w:rPr>
+              <w:t>3</w:t>
+            </w:r>
+            <w:r>
+              <w:rPr>
+                <w:rFonts w:cstheme="majorHAnsi"/>
+                <w:sz w:val="22"/>
+                <w:szCs w:val="22"/>
+              </w:rPr>
+              <w:t>Details1}</w:t>
+            </w:r>
+          </w:p>
+          <w:p>
+            <w:pPr>
+              <w:pStyle w:val="ResumeText"/>
+              <w:numPr>
+                <w:ilvl w:val="0"/>
+                <w:numId w:val="9"/>
+              </w:numPr>
+              <w:spacing w:after="0"/>
+              <w:ind w:left="360" w:right="0"/>
+              <w:rPr>
+                <w:rFonts w:cstheme="majorHAnsi"/>
+                <w:sz w:val="22"/>
+                <w:szCs w:val="22"/>
+              </w:rPr>
+            </w:pPr>
+            <w:r>
+              <w:rPr>
+                <w:rFonts w:cstheme="majorHAnsi"/>
+                <w:sz w:val="22"/>
+                <w:szCs w:val="22"/>
+              </w:rPr>
+              <w:t>{J</w:t>
+            </w:r>
+            <w:r>
+              <w:rPr>
+                <w:rFonts w:cstheme="majorHAnsi"/>
+                <w:sz w:val="22"/>
+                <w:szCs w:val="22"/>
+              </w:rPr>
+              <w:t>3</w:t>
+            </w:r>
+            <w:r>
+              <w:rPr>
+                <w:rFonts w:cstheme="majorHAnsi"/>
+                <w:sz w:val="22"/>
+                <w:szCs w:val="22"/>
+              </w:rPr>
+              <w:t>Details2}</w:t>
+            </w:r>
+          </w:p>
+          <w:p>
+            <w:pPr>
+              <w:pStyle w:val="ResumeText"/>
+              <w:numPr>
+                <w:ilvl w:val="0"/>
+                <w:numId w:val="9"/>
+              </w:numPr>
+              <w:spacing w:after="0"/>
+              <w:ind w:left="360" w:right="0"/>
+              <w:rPr>
+                <w:rFonts w:cstheme="majorHAnsi"/>
+                <w:sz w:val="22"/>
+                <w:szCs w:val="22"/>
+              </w:rPr>
+            </w:pPr>
+            <w:r>
+              <w:rPr>
+                <w:rFonts w:cstheme="majorHAnsi"/>
+                <w:sz w:val="22"/>
+                <w:szCs w:val="22"/>
+              </w:rPr>
+              <w:t>{J</w:t>
+            </w:r>
+            <w:r>
+              <w:rPr>
+                <w:rFonts w:cstheme="majorHAnsi"/>
+                <w:sz w:val="22"/>
+                <w:szCs w:val="22"/>
+              </w:rPr>
+              <w:t>3</w:t>
+            </w:r>
+            <w:r>
+              <w:rPr>
+                <w:rFonts w:cstheme="majorHAnsi"/>
+                <w:sz w:val="22"/>
+                <w:szCs w:val="22"/>
+              </w:rPr>
+              <w:t>Details3}</w:t>
+            </w:r>
+          </w:p>
+          <w:p>
+            <w:pPr>
+              <w:pStyle w:val="ResumeText"/>
+              <w:numPr>
+                <w:ilvl w:val="0"/>
+                <w:numId w:val="9"/>
+              </w:numPr>
+              <w:spacing w:after="0"/>
+              <w:ind w:left="360" w:right="0"/>
+              <w:rPr>
+                <w:rFonts w:cstheme="majorHAnsi"/>
+                <w:sz w:val="22"/>
+                <w:szCs w:val="22"/>
+              </w:rPr>
+            </w:pPr>
+            <w:r>
+              <w:rPr>
+                <w:rFonts w:cstheme="majorHAnsi"/>
+                <w:sz w:val="22"/>
+                <w:szCs w:val="22"/>
+              </w:rPr>
+              <w:t>{J3Details4}</w:t>
             </w:r>
           </w:p>
         </w:tc>
@@ -940,262 +1145,6 @@
                 <w:szCs w:val="22"/>
               </w:rPr>
               <w:t>Certifications: {Certifications}</w:t>
-            </w:r>
-          </w:p>
-        </w:tc>
-      </w:tr>
-      <w:tr>
-        <w:tc>
-          <w:tcPr>
-            <w:tcW w:w="10800" w:type="dxa"/>
-          </w:tcPr>
-          <w:p>
-            <w:pPr>
-              <w:pStyle w:val="ResumeText"/>
-              <w:spacing w:after="0"/>
-              <w:ind w:right="0"/>
-              <w:jc w:val="center"/>
-              <w:rPr>
-                <w:rFonts w:cstheme="majorHAnsi"/>
-                <w:b/>
-                <w:bCs/>
-                <w:sz w:val="24"/>
-                <w:szCs w:val="24"/>
-              </w:rPr>
-            </w:pPr>
-            <w:r>
-              <w:rPr>
-                <w:rFonts w:cstheme="majorHAnsi"/>
-                <w:b/>
-                <w:bCs/>
-                <w:sz w:val="24"/>
-                <w:szCs w:val="24"/>
-              </w:rPr>
-              <w:t>PERSONAL PROJECTS</w:t>
-            </w:r>
-          </w:p>
-          <w:p>
-            <w:pPr>
-              <w:pStyle w:val="ResumeText"/>
-              <w:spacing w:after="0"/>
-              <w:ind w:right="360"/>
-              <w:rPr>
-                <w:rFonts w:cstheme="majorHAnsi"/>
-                <w:b/>
-                <w:bCs/>
-                <w:sz w:val="22"/>
-                <w:szCs w:val="22"/>
-              </w:rPr>
-            </w:pPr>
-            <w:r>
-              <w:rPr>
-                <w:rFonts w:cstheme="majorHAnsi"/>
-                <w:b/>
-                <w:bCs/>
-                <w:sz w:val="22"/>
-                <w:szCs w:val="22"/>
-              </w:rPr>
-              <w:t>{PersonalProject1}</w:t>
-            </w:r>
-          </w:p>
-          <w:p>
-            <w:pPr>
-              <w:pStyle w:val="ResumeText"/>
-              <w:numPr>
-                <w:ilvl w:val="0"/>
-                <w:numId w:val="10"/>
-              </w:numPr>
-              <w:spacing w:after="0"/>
-              <w:ind w:left="360" w:right="0"/>
-              <w:rPr>
-                <w:rFonts w:cstheme="majorHAnsi"/>
-                <w:sz w:val="22"/>
-                <w:szCs w:val="22"/>
-              </w:rPr>
-            </w:pPr>
-            <w:r>
-              <w:rPr>
-                <w:rFonts w:cstheme="majorHAnsi"/>
-                <w:sz w:val="22"/>
-                <w:szCs w:val="22"/>
-              </w:rPr>
-              <w:t>{P1Details1}</w:t>
-            </w:r>
-          </w:p>
-          <w:p>
-            <w:pPr>
-              <w:pStyle w:val="ResumeText"/>
-              <w:numPr>
-                <w:ilvl w:val="0"/>
-                <w:numId w:val="10"/>
-              </w:numPr>
-              <w:spacing w:after="0"/>
-              <w:ind w:left="360" w:right="0"/>
-              <w:rPr>
-                <w:rFonts w:cstheme="majorHAnsi"/>
-                <w:sz w:val="22"/>
-                <w:szCs w:val="22"/>
-              </w:rPr>
-            </w:pPr>
-            <w:r>
-              <w:rPr>
-                <w:rFonts w:cstheme="majorHAnsi"/>
-                <w:sz w:val="22"/>
-                <w:szCs w:val="22"/>
-              </w:rPr>
-              <w:t>{</w:t>
-            </w:r>
-            <w:r>
-              <w:rPr>
-                <w:rFonts w:cstheme="majorHAnsi"/>
-                <w:sz w:val="22"/>
-                <w:szCs w:val="22"/>
-              </w:rPr>
-              <w:t>P1Details</w:t>
-            </w:r>
-            <w:r>
-              <w:rPr>
-                <w:rFonts w:cstheme="majorHAnsi"/>
-                <w:sz w:val="22"/>
-                <w:szCs w:val="22"/>
-              </w:rPr>
-              <w:t>2</w:t>
-            </w:r>
-            <w:r>
-              <w:rPr>
-                <w:rFonts w:cstheme="majorHAnsi"/>
-                <w:sz w:val="22"/>
-                <w:szCs w:val="22"/>
-              </w:rPr>
-              <w:t>}</w:t>
-            </w:r>
-          </w:p>
-          <w:p>
-            <w:pPr>
-              <w:pStyle w:val="ResumeText"/>
-              <w:spacing w:after="0"/>
-              <w:ind w:right="360"/>
-              <w:rPr>
-                <w:rFonts w:cstheme="majorHAnsi"/>
-                <w:b/>
-                <w:bCs/>
-                <w:sz w:val="22"/>
-                <w:szCs w:val="22"/>
-              </w:rPr>
-            </w:pPr>
-            <w:r>
-              <w:rPr>
-                <w:rFonts w:cstheme="majorHAnsi"/>
-                <w:b/>
-                <w:bCs/>
-                <w:sz w:val="22"/>
-                <w:szCs w:val="22"/>
-              </w:rPr>
-              <w:t>{Persona</w:t>
-            </w:r>
-            <w:r>
-              <w:rPr>
-                <w:rFonts w:cstheme="majorHAnsi"/>
-                <w:b/>
-                <w:bCs/>
-                <w:sz w:val="22"/>
-                <w:szCs w:val="22"/>
-              </w:rPr>
-              <w:t>l</w:t>
-            </w:r>
-            <w:r>
-              <w:rPr>
-                <w:rFonts w:cstheme="majorHAnsi"/>
-                <w:b/>
-                <w:bCs/>
-                <w:sz w:val="22"/>
-                <w:szCs w:val="22"/>
-              </w:rPr>
-              <w:t>Project</w:t>
-            </w:r>
-            <w:r>
-              <w:rPr>
-                <w:rFonts w:cstheme="majorHAnsi"/>
-                <w:b/>
-                <w:bCs/>
-                <w:sz w:val="22"/>
-                <w:szCs w:val="22"/>
-              </w:rPr>
-              <w:t>2</w:t>
-            </w:r>
-            <w:r>
-              <w:rPr>
-                <w:rFonts w:cstheme="majorHAnsi"/>
-                <w:b/>
-                <w:bCs/>
-                <w:sz w:val="22"/>
-                <w:szCs w:val="22"/>
-              </w:rPr>
-              <w:t>}</w:t>
-            </w:r>
-          </w:p>
-          <w:p>
-            <w:pPr>
-              <w:pStyle w:val="ResumeText"/>
-              <w:numPr>
-                <w:ilvl w:val="0"/>
-                <w:numId w:val="10"/>
-              </w:numPr>
-              <w:spacing w:after="0"/>
-              <w:ind w:left="360" w:right="0"/>
-              <w:rPr>
-                <w:rFonts w:cstheme="majorHAnsi"/>
-                <w:sz w:val="22"/>
-                <w:szCs w:val="22"/>
-              </w:rPr>
-            </w:pPr>
-            <w:r>
-              <w:rPr>
-                <w:rFonts w:cstheme="majorHAnsi"/>
-                <w:sz w:val="22"/>
-                <w:szCs w:val="22"/>
-              </w:rPr>
-              <w:t>{P</w:t>
-            </w:r>
-            <w:r>
-              <w:rPr>
-                <w:rFonts w:cstheme="majorHAnsi"/>
-                <w:sz w:val="22"/>
-                <w:szCs w:val="22"/>
-              </w:rPr>
-              <w:t>2</w:t>
-            </w:r>
-            <w:r>
-              <w:rPr>
-                <w:rFonts w:cstheme="majorHAnsi"/>
-                <w:sz w:val="22"/>
-                <w:szCs w:val="22"/>
-              </w:rPr>
-              <w:t>Details1}</w:t>
-            </w:r>
-          </w:p>
-          <w:p>
-            <w:pPr>
-              <w:pStyle w:val="ResumeText"/>
-              <w:numPr>
-                <w:ilvl w:val="0"/>
-                <w:numId w:val="10"/>
-              </w:numPr>
-              <w:spacing w:after="0"/>
-              <w:ind w:left="360" w:right="0"/>
-              <w:rPr>
-                <w:rFonts w:cstheme="majorHAnsi"/>
-                <w:sz w:val="22"/>
-                <w:szCs w:val="22"/>
-              </w:rPr>
-            </w:pPr>
-            <w:r>
-              <w:rPr>
-                <w:rFonts w:cstheme="majorHAnsi"/>
-                <w:sz w:val="22"/>
-                <w:szCs w:val="22"/>
-              </w:rPr>
-              <w:t>{P2Details2}</w:t>
             </w:r>
           </w:p>
         </w:tc>

</xml_diff>